<commit_message>
docs: actualizando archivo word y diagrama
</commit_message>
<xml_diff>
--- a/docs/Proyecto_de_Aula_Creatina_Boys.docx
+++ b/docs/Proyecto_de_Aula_Creatina_Boys.docx
@@ -3733,21 +3733,13 @@
         <w:rPr>
           <w:rFonts w:ascii="Cambria" w:cs="Cambria" w:eastAsia="Cambria" w:hAnsi="Cambria"/>
         </w:rPr>
-        <w:t xml:space="preserve">). Su subpaquete </w:t>
-      </w:r>
-      <w:r>
-        <w:rPr>
-          <w:rFonts w:ascii="Courier New" w:cs="Courier New" w:eastAsia="Courier New" w:hAnsi="Courier New"/>
-          <w:sz w:val="20"/>
-          <w:szCs w:val="20"/>
-        </w:rPr>
-        <w:t xml:space="preserve">com.creatinaboys.repository.parser</w:t>
-      </w:r>
-      <w:r>
-        <w:rPr>
-          <w:rFonts w:ascii="Cambria" w:cs="Cambria" w:eastAsia="Cambria" w:hAnsi="Cambria"/>
-        </w:rPr>
-        <w:t xml:space="preserve"> contiene la interfaz </w:t>
+        <w:t xml:space="preserve">). Además contiene</w:t>
+      </w:r>
+      <w:r>
+        <w:rPr>
+          <w:rFonts w:ascii="Cambria" w:cs="Cambria" w:eastAsia="Cambria" w:hAnsi="Cambria"/>
+        </w:rPr>
+        <w:t xml:space="preserve"> la interfaz </w:t>
       </w:r>
       <w:r>
         <w:rPr>
@@ -4031,7 +4023,7 @@
       <w:r>
         <w:drawing>
           <wp:inline distT="0" distB="0" distL="0" distR="0">
-            <wp:extent cx="5943600" cy="4987158"/>
+            <wp:extent cx="5943600" cy="3200400"/>
             <wp:effectExtent t="0" r="0" b="0" l="0"/>
             <wp:docPr id="1" name="layers-diagram.png" descr="layers-diagram.png" title="layers-diagram.png"/>
             <wp:cNvGraphicFramePr>
@@ -4056,7 +4048,7 @@
                   <pic:spPr bwMode="auto">
                     <a:xfrm>
                       <a:off x="0" y="0"/>
-                      <a:ext cx="5943600" cy="4987158"/>
+                      <a:ext cx="5943600" cy="3200400"/>
                     </a:xfrm>
                     <a:prstGeom prst="rect">
                       <a:avLst/>
@@ -5725,7 +5717,7 @@
                 <w:sz w:val="18"/>
                 <w:szCs w:val="18"/>
               </w:rPr>
-              <w:t xml:space="preserve">repository.parser</w:t>
+              <w:t xml:space="preserve">repository</w:t>
             </w:r>
           </w:p>
         </w:tc>
@@ -5885,7 +5877,7 @@
                 <w:sz w:val="18"/>
                 <w:szCs w:val="18"/>
               </w:rPr>
-              <w:t xml:space="preserve">repository.parser</w:t>
+              <w:t xml:space="preserve">repository</w:t>
             </w:r>
           </w:p>
         </w:tc>
@@ -6045,7 +6037,7 @@
                 <w:sz w:val="18"/>
                 <w:szCs w:val="18"/>
               </w:rPr>
-              <w:t xml:space="preserve">repository.parser</w:t>
+              <w:t xml:space="preserve">repository</w:t>
             </w:r>
           </w:p>
         </w:tc>
@@ -6205,7 +6197,7 @@
                 <w:sz w:val="18"/>
                 <w:szCs w:val="18"/>
               </w:rPr>
-              <w:t xml:space="preserve">repository.parser</w:t>
+              <w:t xml:space="preserve">repository</w:t>
             </w:r>
           </w:p>
         </w:tc>
@@ -14562,7 +14554,7 @@
         <w:rPr>
           <w:rFonts w:ascii="Cambria" w:cs="Cambria" w:eastAsia="Cambria" w:hAnsi="Cambria"/>
         </w:rPr>
-        <w:t xml:space="preserve"> Interfaz (paquete repository.parser)</w:t>
+        <w:t xml:space="preserve"> Interfaz (paquete repository)</w:t>
       </w:r>
     </w:p>
     <w:p>
@@ -15288,7 +15280,7 @@
         <w:rPr>
           <w:rFonts w:ascii="Cambria" w:cs="Cambria" w:eastAsia="Cambria" w:hAnsi="Cambria"/>
         </w:rPr>
-        <w:t xml:space="preserve"> Clase concreta (paquete repository.parser)</w:t>
+        <w:t xml:space="preserve"> Clase concreta (paquete repository)</w:t>
       </w:r>
     </w:p>
     <w:p>

</xml_diff>